<commit_message>
Add OpenAI LLM upgrades and update project docs
</commit_message>
<xml_diff>
--- a/docs/CSE598-Project-Janus-Proposal.docx
+++ b/docs/CSE598-Project-Janus-Proposal.docx
@@ -604,11 +604,7 @@
         <w:spacing w:after="20" w:line="252" w:lineRule="auto"/>
       </w:pPr>
       <w:r>
-        <w:rPr>
-          <w:rFonts w:ascii="Calibri" w:hAnsi="Calibri"/>
-          <w:sz w:val="21"/>
-        </w:rPr>
-        <w:t>Learn stage plus Janus Gate validation and install, a localhost web console with multiple use cases, and an offline CLI baseline.</w:t>
+        <w:t>Learn stage plus Janus Gate validation and install, a localhost web console with multiple use cases, an offline CLI baseline, and optional OpenAI LLM roles for adversary planning, defense rationales, and operator briefing.</w:t>
       </w:r>
     </w:p>
     <w:p>
@@ -684,12 +680,7 @@
         <w:spacing w:after="60" w:line="252" w:lineRule="auto"/>
       </w:pPr>
       <w:r>
-        <w:rPr>
-          <w:rFonts w:ascii="Calibri" w:hAnsi="Calibri"/>
-          <w:sz w:val="21"/>
-        </w:rPr>
-        <w:lastRenderedPageBreak/>
-        <w:t>Baseline type: tool-use / workflow baseline with a rule-based policy world and a small tabular ASA learner. It is intentionally simple, but it fully runs the Duplicate -&gt; Attack -&gt; Learn -&gt; Deploy loop and is therefore a reasonable starting point for later LLM/RL upgrades.</w:t>
+        <w:t>Baseline type: tool-use / workflow baseline with a rule-based policy world and a small tabular ASA learner. It is intentionally simple, but it fully runs the Duplicate -&gt; Attack -&gt; Learn -&gt; Deploy loop and is therefore a reasonable starting point for OpenAI LLM upgrades.</w:t>
       </w:r>
     </w:p>
     <w:p>
@@ -784,11 +775,7 @@
         <w:spacing w:after="20" w:line="252" w:lineRule="auto"/>
       </w:pPr>
       <w:r>
-        <w:rPr>
-          <w:rFonts w:ascii="Calibri" w:hAnsi="Calibri"/>
-          <w:sz w:val="21"/>
-        </w:rPr>
-        <w:t>No external model API key is required for the graded baseline.</w:t>
+        <w:t>No external model API key is required for the graded baseline. Optional OpenAI LLM upgrades use OPENAI_API_KEY in a local .env file.</w:t>
       </w:r>
     </w:p>
     <w:p>
@@ -1850,11 +1837,7 @@
         <w:spacing w:after="20" w:line="252" w:lineRule="auto"/>
       </w:pPr>
       <w:r>
-        <w:rPr>
-          <w:rFonts w:ascii="Calibri" w:hAnsi="Calibri"/>
-          <w:sz w:val="21"/>
-        </w:rPr>
-        <w:t>Latency of the full loop, ASA episodes-to-break, false-deploy or over-refusal rate, and optional later cost if LLM components are added.</w:t>
+        <w:t>Latency of the full loop, ASA episodes-to-break, false-deploy or over-refusal rate, and optional OpenAI LLM cost when those roles are enabled.</w:t>
       </w:r>
     </w:p>
     <w:p>
@@ -1986,19 +1969,7 @@
         <w:spacing w:after="20" w:line="252" w:lineRule="auto"/>
       </w:pPr>
       <w:r>
-        <w:rPr>
-          <w:rFonts w:ascii="Calibri" w:hAnsi="Calibri"/>
-          <w:b/>
-          <w:sz w:val="21"/>
-        </w:rPr>
-        <w:t xml:space="preserve">Optional extension. </w:t>
-      </w:r>
-      <w:r>
-        <w:rPr>
-          <w:rFonts w:ascii="Calibri" w:hAnsi="Calibri"/>
-          <w:sz w:val="21"/>
-        </w:rPr>
-        <w:t>Optional LLM assistance for countermeasure wording, without relaxing containment.</w:t>
+        <w:t>OpenAI LLM extension. Optional OpenAI LLM adversary planning, Learn-stage defense rationales, and operator briefing, without relaxing containment or leaving the closed action catalog.</w:t>
       </w:r>
     </w:p>
     <w:p>
@@ -2028,19 +1999,7 @@
         <w:spacing w:after="20" w:line="252" w:lineRule="auto"/>
       </w:pPr>
       <w:r>
-        <w:rPr>
-          <w:rFonts w:ascii="Calibri" w:hAnsi="Calibri"/>
-          <w:b/>
-          <w:sz w:val="21"/>
-        </w:rPr>
-        <w:t xml:space="preserve">Help / data / infra needed. </w:t>
-      </w:r>
-      <w:r>
-        <w:rPr>
-          <w:rFonts w:ascii="Calibri" w:hAnsi="Calibri"/>
-          <w:sz w:val="21"/>
-        </w:rPr>
-        <w:t>A larger labeled telemetry and use-case set. Later one model API key only if LLM roles are added.</w:t>
+        <w:t>Help / data / infra needed. A larger labeled telemetry and use-case set. One OpenAI LLM API key only when optional LLM roles are used.</w:t>
       </w:r>
     </w:p>
     <w:sectPr>

</xml_diff>

<commit_message>
Deatils updated about LLM
</commit_message>
<xml_diff>
--- a/docs/CSE598-Project-Janus-Proposal.docx
+++ b/docs/CSE598-Project-Janus-Proposal.docx
@@ -595,7 +595,7 @@
           <w:rFonts w:ascii="Calibri" w:hAnsi="Calibri"/>
           <w:sz w:val="21"/>
         </w:rPr>
-        <w:t>RME sanitization and twin hydration, plus an ASA tabular learner over a closed simulator action catalog for horizon N.</w:t>
+        <w:t>RME sanitization and twin hydration, plus an ASA tabular learner over a closed simulator action catalog for horizon.</w:t>
       </w:r>
     </w:p>
     <w:p>
@@ -604,7 +604,7 @@
         <w:spacing w:after="20" w:line="252" w:lineRule="auto"/>
       </w:pPr>
       <w:r>
-        <w:t>Learn stage plus Janus Gate validation and install, a localhost web console with multiple use cases, an offline CLI baseline, and optional OpenAI LLM roles for adversary planning, defense rationales, and operator briefing.</w:t>
+        <w:t>Learn stage plus Janus Gate validation and install, a localhost web console with multiple use cases, an offline CLI baseline, and optional OpenAI LLM roles.</w:t>
       </w:r>
     </w:p>
     <w:p>
@@ -680,6 +680,7 @@
         <w:spacing w:after="60" w:line="252" w:lineRule="auto"/>
       </w:pPr>
       <w:r>
+        <w:lastRenderedPageBreak/>
         <w:t>Baseline type: tool-use / workflow baseline with a rule-based policy world and a small tabular ASA learner. It is intentionally simple, but it fully runs the Duplicate -&gt; Attack -&gt; Learn -&gt; Deploy loop and is therefore a reasonable starting point for OpenAI LLM upgrades.</w:t>
       </w:r>
     </w:p>
@@ -775,7 +776,7 @@
         <w:spacing w:after="20" w:line="252" w:lineRule="auto"/>
       </w:pPr>
       <w:r>
-        <w:t>No external model API key is required for the graded baseline. Optional OpenAI LLM upgrades use OPENAI_API_KEY in a local .env file.</w:t>
+        <w:t>No external model API key is required for the graded baseline. Optional OpenAI LLM upgrades use OPENAI_API_KEY in a local .env file (never committed to the repository).</w:t>
       </w:r>
     </w:p>
     <w:p>
@@ -875,145 +876,113 @@
         <w:ind w:left="173"/>
       </w:pPr>
       <w:r>
+        <w:t>4) Learn. aswa/learn.py logs vulnerabilities and designs countermeasures (firewall, DLP, payment, workflow rules). When OpenAI LLM is enabled, each designed defense also receives a short operator-facing rationale.</w:t>
+      </w:r>
+    </w:p>
+    <w:p>
+      <w:pPr>
+        <w:spacing w:after="20" w:line="252" w:lineRule="auto"/>
+        <w:ind w:left="173"/>
+      </w:pPr>
+      <w:r>
         <w:rPr>
           <w:rFonts w:ascii="Calibri" w:hAnsi="Calibri"/>
           <w:b/>
           <w:sz w:val="21"/>
         </w:rPr>
-        <w:t xml:space="preserve">4) Learn. </w:t>
+        <w:t xml:space="preserve">5) Deploy. </w:t>
       </w:r>
       <w:r>
         <w:rPr>
           <w:rFonts w:ascii="Calibri" w:hAnsi="Calibri"/>
           <w:sz w:val="21"/>
         </w:rPr>
-        <w:t>aswa/learn.py logs vulnerabilities and designs countermeasures (firewall, DLP, payment, workflow rules).</w:t>
+        <w:t>aswa/janus_gate.py validates defenses and blocks attack-trace export. webapp.py can install approved patches into production.</w:t>
       </w:r>
     </w:p>
     <w:p>
       <w:pPr>
-        <w:spacing w:after="20" w:line="252" w:lineRule="auto"/>
-        <w:ind w:left="173"/>
-      </w:pPr>
-      <w:r>
-        <w:rPr>
-          <w:rFonts w:ascii="Calibri" w:hAnsi="Calibri"/>
-          <w:b/>
+        <w:spacing w:after="60" w:line="252" w:lineRule="auto"/>
+      </w:pPr>
+      <w:r>
+        <w:rPr>
+          <w:rFonts w:ascii="Calibri" w:hAnsi="Calibri"/>
           <w:sz w:val="21"/>
         </w:rPr>
-        <w:t xml:space="preserve">5) Deploy. </w:t>
-      </w:r>
-      <w:r>
-        <w:rPr>
-          <w:rFonts w:ascii="Calibri" w:hAnsi="Calibri"/>
-          <w:sz w:val="21"/>
-        </w:rPr>
-        <w:t>aswa/janus_gate.py validates defenses and blocks attack-trace export. webapp.py can install approved patches into production.</w:t>
+        <w:t>Implementation files.</w:t>
       </w:r>
     </w:p>
     <w:p>
       <w:pPr>
-        <w:spacing w:after="60" w:line="252" w:lineRule="auto"/>
-      </w:pPr>
-      <w:r>
-        <w:rPr>
-          <w:rFonts w:ascii="Calibri" w:hAnsi="Calibri"/>
-          <w:sz w:val="21"/>
-        </w:rPr>
-        <w:t>Implementation files.</w:t>
-      </w:r>
-    </w:p>
-    <w:p>
-      <w:pPr>
         <w:pStyle w:val="ListBullet"/>
         <w:spacing w:after="20" w:line="252" w:lineRule="auto"/>
       </w:pPr>
       <w:r>
-        <w:rPr>
-          <w:rFonts w:ascii="Calibri" w:hAnsi="Calibri"/>
-          <w:sz w:val="21"/>
-        </w:rPr>
         <w:t xml:space="preserve">run_baseline.py, </w:t>
       </w:r>
       <w:proofErr w:type="spellStart"/>
       <w:r>
-        <w:rPr>
-          <w:rFonts w:ascii="Calibri" w:hAnsi="Calibri"/>
-          <w:sz w:val="21"/>
-        </w:rPr>
         <w:t>aswa</w:t>
       </w:r>
       <w:proofErr w:type="spellEnd"/>
       <w:r>
-        <w:rPr>
-          <w:rFonts w:ascii="Calibri" w:hAnsi="Calibri"/>
-          <w:sz w:val="21"/>
-        </w:rPr>
         <w:t xml:space="preserve">/rme.py, </w:t>
       </w:r>
       <w:proofErr w:type="spellStart"/>
       <w:r>
-        <w:rPr>
-          <w:rFonts w:ascii="Calibri" w:hAnsi="Calibri"/>
-          <w:sz w:val="21"/>
-        </w:rPr>
         <w:t>aswa</w:t>
       </w:r>
       <w:proofErr w:type="spellEnd"/>
       <w:r>
-        <w:rPr>
-          <w:rFonts w:ascii="Calibri" w:hAnsi="Calibri"/>
-          <w:sz w:val="21"/>
-        </w:rPr>
         <w:t xml:space="preserve">/asa.py, </w:t>
       </w:r>
       <w:proofErr w:type="spellStart"/>
       <w:r>
-        <w:rPr>
-          <w:rFonts w:ascii="Calibri" w:hAnsi="Calibri"/>
-          <w:sz w:val="21"/>
-        </w:rPr>
         <w:t>aswa</w:t>
       </w:r>
       <w:proofErr w:type="spellEnd"/>
       <w:r>
-        <w:rPr>
-          <w:rFonts w:ascii="Calibri" w:hAnsi="Calibri"/>
-          <w:sz w:val="21"/>
-        </w:rPr>
         <w:t xml:space="preserve">/learn.py, </w:t>
       </w:r>
       <w:proofErr w:type="spellStart"/>
       <w:r>
-        <w:rPr>
-          <w:rFonts w:ascii="Calibri" w:hAnsi="Calibri"/>
-          <w:sz w:val="21"/>
-        </w:rPr>
         <w:t>aswa</w:t>
       </w:r>
       <w:proofErr w:type="spellEnd"/>
       <w:r>
-        <w:rPr>
-          <w:rFonts w:ascii="Calibri" w:hAnsi="Calibri"/>
-          <w:sz w:val="21"/>
-        </w:rPr>
         <w:t xml:space="preserve">/janus_gate.py, </w:t>
       </w:r>
       <w:proofErr w:type="spellStart"/>
       <w:r>
-        <w:rPr>
-          <w:rFonts w:ascii="Calibri" w:hAnsi="Calibri"/>
-          <w:sz w:val="21"/>
-        </w:rPr>
         <w:t>aswa</w:t>
       </w:r>
       <w:proofErr w:type="spellEnd"/>
       <w:r>
-        <w:rPr>
-          <w:rFonts w:ascii="Calibri" w:hAnsi="Calibri"/>
-          <w:sz w:val="21"/>
-        </w:rPr>
-        <w:t>/pipeline.py, aswa/world.py</w:t>
+        <w:t xml:space="preserve">/pipeline.py, </w:t>
+      </w:r>
+      <w:proofErr w:type="spellStart"/>
+      <w:r>
+        <w:t>aswa</w:t>
+      </w:r>
+      <w:proofErr w:type="spellEnd"/>
+      <w:r>
+        <w:t xml:space="preserve">/world.py, </w:t>
+      </w:r>
+      <w:proofErr w:type="spellStart"/>
+      <w:r>
+        <w:t>aswa</w:t>
+      </w:r>
+      <w:proofErr w:type="spellEnd"/>
+      <w:r>
+        <w:t xml:space="preserve">/llm.py, </w:t>
+      </w:r>
+      <w:proofErr w:type="spellStart"/>
+      <w:r>
+        <w:t>aswa</w:t>
+      </w:r>
+      <w:proofErr w:type="spellEnd"/>
+      <w:r>
+        <w:t>/agents_llm.py, scripts/test_openai_llm.py, scripts/demo_llm_aswa.py</w:t>
       </w:r>
     </w:p>
     <w:p>
@@ -1221,9 +1190,9 @@
           <w:noProof/>
         </w:rPr>
         <w:drawing>
-          <wp:inline distT="0" distB="0" distL="0" distR="0" wp14:anchorId="1C27EC31" wp14:editId="429CD1C4">
-            <wp:extent cx="5852160" cy="3680358"/>
-            <wp:effectExtent l="0" t="0" r="0" b="0"/>
+          <wp:inline distT="0" distB="0" distL="0" distR="0" wp14:anchorId="1C27EC31" wp14:editId="6DF0EDD0">
+            <wp:extent cx="5419725" cy="3408404"/>
+            <wp:effectExtent l="0" t="0" r="0" b="1905"/>
             <wp:docPr id="1" name="Picture 1"/>
             <wp:cNvGraphicFramePr>
               <a:graphicFrameLocks xmlns:a="http://schemas.openxmlformats.org/drawingml/2006/main" noChangeAspect="1"/>
@@ -1244,7 +1213,7 @@
                   <pic:spPr>
                     <a:xfrm>
                       <a:off x="0" y="0"/>
-                      <a:ext cx="5852160" cy="3680358"/>
+                      <a:ext cx="5437509" cy="3419588"/>
                     </a:xfrm>
                     <a:prstGeom prst="rect">
                       <a:avLst/>
@@ -1296,6 +1265,7 @@
           <w:b/>
           <w:sz w:val="21"/>
         </w:rPr>
+        <w:lastRenderedPageBreak/>
         <w:t>What worked.</w:t>
       </w:r>
     </w:p>
@@ -1308,7 +1278,6 @@
           <w:rFonts w:ascii="Calibri" w:hAnsi="Calibri"/>
           <w:sz w:val="21"/>
         </w:rPr>
-        <w:lastRenderedPageBreak/>
         <w:t>Secret token was redacted ([REDACTED]). Twin ready. ASA broke the shadow. Four defenses were designed and validated.</w:t>
       </w:r>
     </w:p>
@@ -1519,26 +1488,26 @@
         <w:ind w:left="173"/>
       </w:pPr>
       <w:r>
-        <w:rPr>
-          <w:rFonts w:ascii="Calibri" w:hAnsi="Calibri"/>
-          <w:b/>
-          <w:sz w:val="21"/>
-        </w:rPr>
-        <w:t xml:space="preserve">3) API keys. </w:t>
-      </w:r>
-      <w:r>
-        <w:rPr>
-          <w:rFonts w:ascii="Calibri" w:hAnsi="Calibri"/>
-          <w:sz w:val="21"/>
-        </w:rPr>
-        <w:t>None required for the baseline. Local demo token (web only): Bearer prod-secret-</w:t>
+        <w:t xml:space="preserve">3) API keys. None required for the baseline. Optional OpenAI LLM: set OPENAI_API_KEY </w:t>
+      </w:r>
+      <w:proofErr w:type="gramStart"/>
+      <w:r>
+        <w:t>in .env</w:t>
+      </w:r>
+      <w:proofErr w:type="gramEnd"/>
+      <w:r>
+        <w:t>, then run python scripts/test_openai_llm.py and python scripts/demo_llm_aswa.py --input examples/</w:t>
       </w:r>
       <w:proofErr w:type="spellStart"/>
       <w:r>
-        <w:rPr>
-          <w:rFonts w:ascii="Calibri" w:hAnsi="Calibri"/>
-          <w:sz w:val="21"/>
-        </w:rPr>
+        <w:t>test_unsafe.json</w:t>
+      </w:r>
+      <w:proofErr w:type="spellEnd"/>
+      <w:r>
+        <w:t>. Local demo token (web only): Bearer prod-secret-</w:t>
+      </w:r>
+      <w:proofErr w:type="spellStart"/>
+      <w:r>
         <w:t>abc</w:t>
       </w:r>
       <w:proofErr w:type="spellEnd"/>
@@ -1653,35 +1622,23 @@
         <w:ind w:left="173"/>
       </w:pPr>
       <w:r>
-        <w:rPr>
-          <w:rFonts w:ascii="Calibri" w:hAnsi="Calibri"/>
-          <w:b/>
-          <w:sz w:val="21"/>
-        </w:rPr>
-        <w:t xml:space="preserve">7) Output location. </w:t>
-      </w:r>
-      <w:r>
-        <w:rPr>
-          <w:rFonts w:ascii="Calibri" w:hAnsi="Calibri"/>
-          <w:sz w:val="21"/>
-        </w:rPr>
-        <w:t>Console printout, examples/</w:t>
+        <w:t>7) Output location. Console printout, examples/</w:t>
       </w:r>
       <w:proofErr w:type="spellStart"/>
       <w:r>
-        <w:rPr>
-          <w:rFonts w:ascii="Calibri" w:hAnsi="Calibri"/>
-          <w:sz w:val="21"/>
-        </w:rPr>
         <w:t>last_run.json</w:t>
       </w:r>
       <w:proofErr w:type="spellEnd"/>
       <w:r>
-        <w:rPr>
-          <w:rFonts w:ascii="Calibri" w:hAnsi="Calibri"/>
-          <w:sz w:val="21"/>
-        </w:rPr>
-        <w:t>, and web UI Light/Shadow panels</w:t>
+        <w:t>, optional examples/</w:t>
+      </w:r>
+      <w:proofErr w:type="spellStart"/>
+      <w:r>
+        <w:t>last_llm_run.json</w:t>
+      </w:r>
+      <w:proofErr w:type="spellEnd"/>
+      <w:r>
+        <w:t xml:space="preserve"> for the OpenAI LLM demo, and web UI Light/Shadow panels</w:t>
       </w:r>
     </w:p>
     <w:p>
@@ -1969,7 +1926,24 @@
         <w:spacing w:after="20" w:line="252" w:lineRule="auto"/>
       </w:pPr>
       <w:r>
-        <w:t>OpenAI LLM extension. Optional OpenAI LLM adversary planning, Learn-stage defense rationales, and operator briefing, without relaxing containment or leaving the closed action catalog.</w:t>
+        <w:lastRenderedPageBreak/>
+        <w:t xml:space="preserve">OpenAI LLM </w:t>
+      </w:r>
+      <w:proofErr w:type="gramStart"/>
+      <w:r>
+        <w:t>use</w:t>
+      </w:r>
+      <w:proofErr w:type="gramEnd"/>
+      <w:r>
+        <w:t xml:space="preserve"> in this project. The graded baseline remains Q-learning ASA with no API key. OpenAI LLM is an optional upgrade that does three jobs only: (1) Adversary planning: propose an N-step shadow plan from mirrored telemetry using only the closed ACTION_CATALOG ids; (2) Learn rationales: write short operator explanations for each designed defense before Janus Gate deploy; (3) Operator briefing: summarize Duplicate -&gt; Attack -&gt; Learn -&gt; Deploy for a security engineer. </w:t>
+      </w:r>
+      <w:proofErr w:type="gramStart"/>
+      <w:r>
+        <w:t>The LLM</w:t>
+      </w:r>
+      <w:proofErr w:type="gramEnd"/>
+      <w:r>
+        <w:t xml:space="preserve"> does not invent real exploits, does not leave the twin, and does not replace Gate validation.</w:t>
       </w:r>
     </w:p>
     <w:p>

</xml_diff>